<commit_message>
setting up connection and test run
</commit_message>
<xml_diff>
--- a/Firebase Assignment Submission.docx
+++ b/Firebase Assignment Submission.docx
@@ -217,6 +217,39 @@
                 <w:color w:val="1A365D"/>
                 <w:sz w:val="20"/>
               </w:rPr>
+              <w:t>Firebase Project</w:t>
+            </w:r>
+          </w:p>
+        </w:tc>
+        <w:tc>
+          <w:tcPr>
+            <w:tcW w:type="dxa" w:w="6480"/>
+            <w:shd w:fill="FFFFFF"/>
+          </w:tcPr>
+          <w:p>
+            <w:r>
+              <w:rPr>
+                <w:color w:val="2D3748"/>
+                <w:sz w:val="20"/>
+              </w:rPr>
+              <w:t>devraj-todo (Project Number: 878011951716)</w:t>
+            </w:r>
+          </w:p>
+        </w:tc>
+      </w:tr>
+      <w:tr>
+        <w:tc>
+          <w:tcPr>
+            <w:tcW w:type="dxa" w:w="3168"/>
+            <w:shd w:fill="EDF2F7"/>
+          </w:tcPr>
+          <w:p>
+            <w:r>
+              <w:rPr>
+                <w:b/>
+                <w:color w:val="1A365D"/>
+                <w:sz w:val="20"/>
+              </w:rPr>
               <w:t>Topic</w:t>
             </w:r>
           </w:p>
@@ -224,7 +257,7 @@
         <w:tc>
           <w:tcPr>
             <w:tcW w:type="dxa" w:w="6480"/>
-            <w:shd w:fill="FFFFFF"/>
+            <w:shd w:fill="F7FAFC"/>
           </w:tcPr>
           <w:p>
             <w:r>
@@ -295,13 +328,13 @@
         </w:rPr>
         <w:t>The application implements the Model-View-ViewModel (MVVM) architecture with Unidirectional Data Flow (UDF):</w:t>
         <w:br/>
-        <w:t>- Task Model: Encapsulates id, description, priority (High, Medium, Low), completion status, and timestamps.</w:t>
+        <w:t>- Task Model: Simple data class encapsulating id, description, and priority (High, Medium, Low).</w:t>
         <w:br/>
-        <w:t>- TaskRepository: Interfaces with Firebase Realtime Database using Kotlin Coroutines callbackFlow to transform Firebase ValueEventListener snapshots into asynchronous streams.</w:t>
+        <w:t>- TaskRepository: Interfaces with Firebase Realtime Database (devraj-todo) using Kotlin Coroutines callbackFlow to transform Firebase ValueEventListener snapshots into asynchronous streams.</w:t>
         <w:br/>
-        <w:t>- TodoViewModel: Hoists UI state into StateFlow&lt;TodoUiState&gt; and enforces priority sorting (High [0] -&gt; Medium [1] -&gt; Low [2]), search filtering, and error handling.</w:t>
+        <w:t>- TodoViewModel: Hoists UI state into StateFlow&lt;TodoUiState&gt; and enforces priority sorting (High [0] -&gt; Medium [1] -&gt; Low [2]) and error handling.</w:t>
         <w:br/>
-        <w:t>- TodoScreen (Compose UI): Renders the state reactively using LazyColumn with stable keys, Material 3 SwipeToDismissBox for swipe-to-delete, and elevated cards.</w:t>
+        <w:t>- TodoScreen (Compose UI): Renders the state reactively using LazyColumn with stable keys, Material 3 SwipeToDismissBox for swipe-to-delete, PriorityDropdown, and elevated cards.</w:t>
       </w:r>
     </w:p>
     <w:p>
@@ -454,13 +487,13 @@
         <w:br/>
         <w:t>Offline Handling:</w:t>
         <w:br/>
-        <w:t>1. Local Disk Persistence: Enabling setPersistenceEnabled(true) activates a local on-device SQLite database that caches synchronized data across app lifecycles.</w:t>
+        <w:t>1. Local Disk Persistence: When enabled, Firebase caches synchronized data locally, allowing instant reads on app restart.</w:t>
         <w:br/>
         <w:t>2. Immediate Optimistic UI Updates: Offline mutations fire local events immediately so the user experiences zero lag.</w:t>
         <w:br/>
         <w:t>3. Local Write Queue: Offline operations are held in a sequential queue.</w:t>
         <w:br/>
-        <w:t>4. Delta Sync &amp; Conflict Resolution: Upon network reconnection, queued writes are sent to the server. The server processes operations chronologically (e.g., using ServerValue.TIMESTAMP) and reconciles any conflicting changes.</w:t>
+        <w:t>4. Delta Sync &amp; Conflict Resolution: Upon network reconnection, queued writes are sent to the server. The server processes operations chronologically and reconciles any conflicting changes.</w:t>
       </w:r>
     </w:p>
     <w:p>
@@ -590,7 +623,7 @@
           <w:color w:val="2D3748"/>
           <w:sz w:val="21"/>
         </w:rPr>
-        <w:t>Implemented dynamic multi-tier sorting (High -&gt; Medium -&gt; Low) observed through StateFlow, automatically updating Compose LazyColumn lists.</w:t>
+        <w:t>Implemented dynamic sorting (High -&gt; Medium -&gt; Low) observed through StateFlow, automatically updating Compose LazyColumn lists.</w:t>
       </w:r>
     </w:p>
     <w:p>
@@ -611,7 +644,7 @@
           <w:color w:val="2D3748"/>
           <w:sz w:val="21"/>
         </w:rPr>
-        <w:t>Implemented Material 3 SwipeToDismissBox with directional color cues, icon indicators, and undo Snackbar actions.</w:t>
+        <w:t>Implemented Material 3 SwipeToDismissBox with directional color cues, icon indicators, and dialog-based editing.</w:t>
       </w:r>
     </w:p>
     <w:p>
@@ -634,6 +667,8 @@
           <w:sz w:val="21"/>
         </w:rPr>
         <w:t>GitHub Repository: https://github.com/dev-raj-murari/Firebase-Realtime-Database-ToDo-Compose</w:t>
+        <w:br/>
+        <w:t>Firebase Console: https://console.firebase.google.com/u/0/project/devraj-todo/overview</w:t>
         <w:br/>
         <w:t>Student Name: Devraj Murari</w:t>
         <w:br/>

</xml_diff>